<commit_message>
add diagram to architecture document
</commit_message>
<xml_diff>
--- a/Credit_Dossier_Architecture_Document_v1.0.docx
+++ b/Credit_Dossier_Architecture_Document_v1.0.docx
@@ -16209,6 +16209,273 @@
             </w:pPr>
             <w:r>
               <w:t xml:space="preserve">Storage and UI expose provenance</w:t>
+            </w:r>
+          </w:p>
+        </w:tc>
+      </w:tr>
+    </w:tbl>
+    <w:p>
+      <w:pPr>
+        <w:pStyle w:val="Heading3"/>
+      </w:pPr>
+      <w:r>
+        <w:t>System Context and Trust-Boundary Design</w:t>
+      </w:r>
+    </w:p>
+    <w:p>
+      <w:pPr>
+        <w:pStyle w:val="CSTemplate-Normal"/>
+      </w:pPr>
+      <w:r>
+        <w:t>The browser is an untrusted presentation tier. FastAPI is the authoritative policy and workflow boundary; it validates requests, resolves identity, enforces role and deal ownership, and controls all persistence and AI calls. The MCP is a separately deployed integration service and never grants browser access to its database or company libraries.</w:t>
+      </w:r>
+    </w:p>
+    <w:p>
+      <w:pPr>
+        <w:pStyle w:val="CSTemplate-Normal"/>
+      </w:pPr>
+      <w:r>
+        <w:t>Data crosses each boundary through an explicit protocol: JSON/HTTP between browser and API, SQL between services and PostgreSQL, SSE between API and MCP, and HTTPS SDK/API calls to Mistral and optional telemetry services.</w:t>
+      </w:r>
+    </w:p>
+    <w:p>
+      <w:pPr>
+        <w:jc w:val="center"/>
+      </w:pPr>
+      <w:r>
+        <w:drawing>
+          <wp:inline xmlns:wp="http://schemas.openxmlformats.org/drawingml/2006/wordprocessingDrawing" xmlns:a="http://schemas.openxmlformats.org/drawingml/2006/main" xmlns:pic="http://schemas.openxmlformats.org/drawingml/2006/picture">
+            <wp:extent cx="6035040" cy="3756740"/>
+            <wp:docPr id="1" name="Picture 1"/>
+            <wp:cNvGraphicFramePr>
+              <a:graphicFrameLocks noChangeAspect="1"/>
+            </wp:cNvGraphicFramePr>
+            <a:graphic>
+              <a:graphicData uri="http://schemas.openxmlformats.org/drawingml/2006/picture">
+                <pic:pic>
+                  <pic:nvPicPr>
+                    <pic:cNvPr id="0" name="01_system_context.png"/>
+                    <pic:cNvPicPr/>
+                  </pic:nvPicPr>
+                  <pic:blipFill>
+                    <a:blip ns3:embed="rId27"/>
+                    <a:stretch>
+                      <a:fillRect/>
+                    </a:stretch>
+                  </pic:blipFill>
+                  <pic:spPr>
+                    <a:xfrm>
+                      <a:off x="0" y="0"/>
+                      <a:ext cx="6035040" cy="3756740"/>
+                    </a:xfrm>
+                    <a:prstGeom prst="rect"/>
+                  </pic:spPr>
+                </pic:pic>
+              </a:graphicData>
+            </a:graphic>
+          </wp:inline>
+        </w:drawing>
+      </w:r>
+    </w:p>
+    <w:p>
+      <w:pPr>
+        <w:pStyle w:val="Caption"/>
+        <w:jc w:val="center"/>
+      </w:pPr>
+      <w:r>
+        <w:t>Figure: System Context and Trust-Boundary Design</w:t>
+      </w:r>
+    </w:p>
+    <w:tbl>
+      <w:tblPr>
+        <w:tblStyle w:val="TableGrid"/>
+        <w:tblW w:type="auto" w:w="0"/>
+        <w:jc w:val="center"/>
+        <w:tblLook w:firstColumn="1" w:firstRow="1" w:lastColumn="0" w:lastRow="0" w:noHBand="0" w:noVBand="1" w:val="04A0"/>
+      </w:tblPr>
+      <w:tblGrid>
+        <w:gridCol w:w="3120"/>
+        <w:gridCol w:w="3120"/>
+        <w:gridCol w:w="3120"/>
+      </w:tblGrid>
+      <w:tr>
+        <w:tc>
+          <w:tcPr>
+            <w:tcW w:type="dxa" w:w="3120"/>
+            <w:shd w:fill="D9EAF7"/>
+            <w:vAlign w:val="center"/>
+          </w:tcPr>
+          <w:p>
+            <w:r>
+              <w:rPr>
+                <w:b/>
+                <w:sz w:val="16"/>
+              </w:rPr>
+              <w:t>Boundary</w:t>
+            </w:r>
+          </w:p>
+        </w:tc>
+        <w:tc>
+          <w:tcPr>
+            <w:tcW w:type="dxa" w:w="3120"/>
+            <w:shd w:fill="D9EAF7"/>
+            <w:vAlign w:val="center"/>
+          </w:tcPr>
+          <w:p>
+            <w:r>
+              <w:rPr>
+                <w:b/>
+                <w:sz w:val="16"/>
+              </w:rPr>
+              <w:t>Responsibilities</w:t>
+            </w:r>
+          </w:p>
+        </w:tc>
+        <w:tc>
+          <w:tcPr>
+            <w:tcW w:type="dxa" w:w="3120"/>
+            <w:shd w:fill="D9EAF7"/>
+            <w:vAlign w:val="center"/>
+          </w:tcPr>
+          <w:p>
+            <w:r>
+              <w:rPr>
+                <w:b/>
+                <w:sz w:val="16"/>
+              </w:rPr>
+              <w:t>Primary controls</w:t>
+            </w:r>
+          </w:p>
+        </w:tc>
+      </w:tr>
+      <w:tr>
+        <w:tc>
+          <w:tcPr>
+            <w:tcW w:type="dxa" w:w="3120"/>
+            <w:vAlign w:val="center"/>
+          </w:tcPr>
+          <w:p>
+            <w:r>
+              <w:rPr>
+                <w:sz w:val="15"/>
+              </w:rPr>
+              <w:t>Browser → API</w:t>
+            </w:r>
+          </w:p>
+        </w:tc>
+        <w:tc>
+          <w:tcPr>
+            <w:tcW w:type="dxa" w:w="3120"/>
+            <w:vAlign w:val="center"/>
+          </w:tcPr>
+          <w:p>
+            <w:r>
+              <w:rPr>
+                <w:sz w:val="15"/>
+              </w:rPr>
+              <w:t>Authenticated business operations</w:t>
+            </w:r>
+          </w:p>
+        </w:tc>
+        <w:tc>
+          <w:tcPr>
+            <w:tcW w:type="dxa" w:w="3120"/>
+            <w:vAlign w:val="center"/>
+          </w:tcPr>
+          <w:p>
+            <w:r>
+              <w:rPr>
+                <w:sz w:val="15"/>
+              </w:rPr>
+              <w:t>HTTP-only session cookie; CORS; validation; server-side RBAC</w:t>
+            </w:r>
+          </w:p>
+        </w:tc>
+      </w:tr>
+      <w:tr>
+        <w:tc>
+          <w:tcPr>
+            <w:tcW w:type="dxa" w:w="3120"/>
+            <w:vAlign w:val="center"/>
+          </w:tcPr>
+          <w:p>
+            <w:r>
+              <w:rPr>
+                <w:sz w:val="15"/>
+              </w:rPr>
+              <w:t>API → Data</w:t>
+            </w:r>
+          </w:p>
+        </w:tc>
+        <w:tc>
+          <w:tcPr>
+            <w:tcW w:type="dxa" w:w="3120"/>
+            <w:vAlign w:val="center"/>
+          </w:tcPr>
+          <w:p>
+            <w:r>
+              <w:rPr>
+                <w:sz w:val="15"/>
+              </w:rPr>
+              <w:t>Workflow and evidence persistence</w:t>
+            </w:r>
+          </w:p>
+        </w:tc>
+        <w:tc>
+          <w:tcPr>
+            <w:tcW w:type="dxa" w:w="3120"/>
+            <w:vAlign w:val="center"/>
+          </w:tcPr>
+          <w:p>
+            <w:r>
+              <w:rPr>
+                <w:sz w:val="15"/>
+              </w:rPr>
+              <w:t>ORM transactions; owner/deal filters; additive migrations</w:t>
+            </w:r>
+          </w:p>
+        </w:tc>
+      </w:tr>
+      <w:tr>
+        <w:tc>
+          <w:tcPr>
+            <w:tcW w:type="dxa" w:w="3120"/>
+            <w:vAlign w:val="center"/>
+          </w:tcPr>
+          <w:p>
+            <w:r>
+              <w:rPr>
+                <w:sz w:val="15"/>
+              </w:rPr>
+              <w:t>API → MCP/Mistral</w:t>
+            </w:r>
+          </w:p>
+        </w:tc>
+        <w:tc>
+          <w:tcPr>
+            <w:tcW w:type="dxa" w:w="3120"/>
+            <w:vAlign w:val="center"/>
+          </w:tcPr>
+          <w:p>
+            <w:r>
+              <w:rPr>
+                <w:sz w:val="15"/>
+              </w:rPr>
+              <w:t>Evidence retrieval and AI processing</w:t>
+            </w:r>
+          </w:p>
+        </w:tc>
+        <w:tc>
+          <w:tcPr>
+            <w:tcW w:type="dxa" w:w="3120"/>
+            <w:vAlign w:val="center"/>
+          </w:tcPr>
+          <w:p>
+            <w:r>
+              <w:rPr>
+                <w:sz w:val="15"/>
+              </w:rPr>
+              <w:t>Scoped identifiers; bounded context; concurrency locks; audit/telemetry</w:t>
             </w:r>
           </w:p>
         </w:tc>
@@ -19606,6 +19873,390 @@
         <w:t xml:space="preserve"/>
       </w:r>
     </w:p>
+    <w:p>
+      <w:pPr>
+        <w:pStyle w:val="Heading3"/>
+      </w:pPr>
+      <w:r>
+        <w:t>Detailed Component Design</w:t>
+      </w:r>
+    </w:p>
+    <w:p>
+      <w:pPr>
+        <w:pStyle w:val="CSTemplate-Normal"/>
+      </w:pPr>
+      <w:r>
+        <w:t>Routers form the HTTP adapter layer and contain no credit-generation logic. Domain services coordinate transactions and lifecycle rules. The generation pipeline composes moderation, evidence selection, orchestration, section generation, source normalization, claim evaluation, confidence judging, version persistence, and observability.</w:t>
+      </w:r>
+    </w:p>
+    <w:p>
+      <w:pPr>
+        <w:pStyle w:val="CSTemplate-Normal"/>
+      </w:pPr>
+      <w:r>
+        <w:t>Agent definitions are global reusable resources, but library attachment is changed only within a protected scope. Models represent persistence; Pydantic schemas enforce input/output contracts; integrations are isolated behind MCP, Mistral-library, scraping, export, and telemetry services.</w:t>
+      </w:r>
+    </w:p>
+    <w:p>
+      <w:pPr>
+        <w:jc w:val="center"/>
+      </w:pPr>
+      <w:r>
+        <w:drawing>
+          <wp:inline xmlns:wp="http://schemas.openxmlformats.org/drawingml/2006/wordprocessingDrawing" xmlns:a="http://schemas.openxmlformats.org/drawingml/2006/main" xmlns:pic="http://schemas.openxmlformats.org/drawingml/2006/picture">
+            <wp:extent cx="6035040" cy="3756740"/>
+            <wp:docPr id="2" name="Picture 2"/>
+            <wp:cNvGraphicFramePr>
+              <a:graphicFrameLocks noChangeAspect="1"/>
+            </wp:cNvGraphicFramePr>
+            <a:graphic>
+              <a:graphicData uri="http://schemas.openxmlformats.org/drawingml/2006/picture">
+                <pic:pic>
+                  <pic:nvPicPr>
+                    <pic:cNvPr id="0" name="02_component_design.png"/>
+                    <pic:cNvPicPr/>
+                  </pic:nvPicPr>
+                  <pic:blipFill>
+                    <a:blip ns3:embed="rId28"/>
+                    <a:stretch>
+                      <a:fillRect/>
+                    </a:stretch>
+                  </pic:blipFill>
+                  <pic:spPr>
+                    <a:xfrm>
+                      <a:off x="0" y="0"/>
+                      <a:ext cx="6035040" cy="3756740"/>
+                    </a:xfrm>
+                    <a:prstGeom prst="rect"/>
+                  </pic:spPr>
+                </pic:pic>
+              </a:graphicData>
+            </a:graphic>
+          </wp:inline>
+        </w:drawing>
+      </w:r>
+    </w:p>
+    <w:p>
+      <w:pPr>
+        <w:pStyle w:val="Caption"/>
+        <w:jc w:val="center"/>
+      </w:pPr>
+      <w:r>
+        <w:t>Figure: Detailed Component Design</w:t>
+      </w:r>
+    </w:p>
+    <w:tbl>
+      <w:tblPr>
+        <w:tblStyle w:val="TableGrid"/>
+        <w:tblW w:type="auto" w:w="0"/>
+        <w:jc w:val="center"/>
+        <w:tblLook w:firstColumn="1" w:firstRow="1" w:lastColumn="0" w:lastRow="0" w:noHBand="0" w:noVBand="1" w:val="04A0"/>
+      </w:tblPr>
+      <w:tblGrid>
+        <w:gridCol w:w="2340"/>
+        <w:gridCol w:w="2340"/>
+        <w:gridCol w:w="2340"/>
+        <w:gridCol w:w="2340"/>
+      </w:tblGrid>
+      <w:tr>
+        <w:tc>
+          <w:tcPr>
+            <w:tcW w:type="dxa" w:w="2340"/>
+            <w:shd w:fill="D9EAF7"/>
+            <w:vAlign w:val="center"/>
+          </w:tcPr>
+          <w:p>
+            <w:r>
+              <w:rPr>
+                <w:b/>
+                <w:sz w:val="16"/>
+              </w:rPr>
+              <w:t>Component</w:t>
+            </w:r>
+          </w:p>
+        </w:tc>
+        <w:tc>
+          <w:tcPr>
+            <w:tcW w:type="dxa" w:w="2340"/>
+            <w:shd w:fill="D9EAF7"/>
+            <w:vAlign w:val="center"/>
+          </w:tcPr>
+          <w:p>
+            <w:r>
+              <w:rPr>
+                <w:b/>
+                <w:sz w:val="16"/>
+              </w:rPr>
+              <w:t>Inbound contract</w:t>
+            </w:r>
+          </w:p>
+        </w:tc>
+        <w:tc>
+          <w:tcPr>
+            <w:tcW w:type="dxa" w:w="2340"/>
+            <w:shd w:fill="D9EAF7"/>
+            <w:vAlign w:val="center"/>
+          </w:tcPr>
+          <w:p>
+            <w:r>
+              <w:rPr>
+                <w:b/>
+                <w:sz w:val="16"/>
+              </w:rPr>
+              <w:t>Outbound dependencies</w:t>
+            </w:r>
+          </w:p>
+        </w:tc>
+        <w:tc>
+          <w:tcPr>
+            <w:tcW w:type="dxa" w:w="2340"/>
+            <w:shd w:fill="D9EAF7"/>
+            <w:vAlign w:val="center"/>
+          </w:tcPr>
+          <w:p>
+            <w:r>
+              <w:rPr>
+                <w:b/>
+                <w:sz w:val="16"/>
+              </w:rPr>
+              <w:t>Failure behavior</w:t>
+            </w:r>
+          </w:p>
+        </w:tc>
+      </w:tr>
+      <w:tr>
+        <w:tc>
+          <w:tcPr>
+            <w:tcW w:type="dxa" w:w="2340"/>
+            <w:vAlign w:val="center"/>
+          </w:tcPr>
+          <w:p>
+            <w:r>
+              <w:rPr>
+                <w:sz w:val="15"/>
+              </w:rPr>
+              <w:t>API routers</w:t>
+            </w:r>
+          </w:p>
+        </w:tc>
+        <w:tc>
+          <w:tcPr>
+            <w:tcW w:type="dxa" w:w="2340"/>
+            <w:vAlign w:val="center"/>
+          </w:tcPr>
+          <w:p>
+            <w:r>
+              <w:rPr>
+                <w:sz w:val="15"/>
+              </w:rPr>
+              <w:t>Validated REST request</w:t>
+            </w:r>
+          </w:p>
+        </w:tc>
+        <w:tc>
+          <w:tcPr>
+            <w:tcW w:type="dxa" w:w="2340"/>
+            <w:vAlign w:val="center"/>
+          </w:tcPr>
+          <w:p>
+            <w:r>
+              <w:rPr>
+                <w:sz w:val="15"/>
+              </w:rPr>
+              <w:t>Domain services</w:t>
+            </w:r>
+          </w:p>
+        </w:tc>
+        <w:tc>
+          <w:tcPr>
+            <w:tcW w:type="dxa" w:w="2340"/>
+            <w:vAlign w:val="center"/>
+          </w:tcPr>
+          <w:p>
+            <w:r>
+              <w:rPr>
+                <w:sz w:val="15"/>
+              </w:rPr>
+              <w:t>Stable error code and correlation event ID</w:t>
+            </w:r>
+          </w:p>
+        </w:tc>
+      </w:tr>
+      <w:tr>
+        <w:tc>
+          <w:tcPr>
+            <w:tcW w:type="dxa" w:w="2340"/>
+            <w:vAlign w:val="center"/>
+          </w:tcPr>
+          <w:p>
+            <w:r>
+              <w:rPr>
+                <w:sz w:val="15"/>
+              </w:rPr>
+              <w:t>Generation service</w:t>
+            </w:r>
+          </w:p>
+        </w:tc>
+        <w:tc>
+          <w:tcPr>
+            <w:tcW w:type="dxa" w:w="2340"/>
+            <w:vAlign w:val="center"/>
+          </w:tcPr>
+          <w:p>
+            <w:r>
+              <w:rPr>
+                <w:sz w:val="15"/>
+              </w:rPr>
+              <w:t>Deal/section ID and instructions</w:t>
+            </w:r>
+          </w:p>
+        </w:tc>
+        <w:tc>
+          <w:tcPr>
+            <w:tcW w:type="dxa" w:w="2340"/>
+            <w:vAlign w:val="center"/>
+          </w:tcPr>
+          <w:p>
+            <w:r>
+              <w:rPr>
+                <w:sz w:val="15"/>
+              </w:rPr>
+              <w:t>Moderation, MCP, libraries, agents, evaluators</w:t>
+            </w:r>
+          </w:p>
+        </w:tc>
+        <w:tc>
+          <w:tcPr>
+            <w:tcW w:type="dxa" w:w="2340"/>
+            <w:vAlign w:val="center"/>
+          </w:tcPr>
+          <w:p>
+            <w:r>
+              <w:rPr>
+                <w:sz w:val="15"/>
+              </w:rPr>
+              <w:t>Blocks unsafe input; records stage failure</w:t>
+            </w:r>
+          </w:p>
+        </w:tc>
+      </w:tr>
+      <w:tr>
+        <w:tc>
+          <w:tcPr>
+            <w:tcW w:type="dxa" w:w="2340"/>
+            <w:vAlign w:val="center"/>
+          </w:tcPr>
+          <w:p>
+            <w:r>
+              <w:rPr>
+                <w:sz w:val="15"/>
+              </w:rPr>
+              <w:t>Version service</w:t>
+            </w:r>
+          </w:p>
+        </w:tc>
+        <w:tc>
+          <w:tcPr>
+            <w:tcW w:type="dxa" w:w="2340"/>
+            <w:vAlign w:val="center"/>
+          </w:tcPr>
+          <w:p>
+            <w:r>
+              <w:rPr>
+                <w:sz w:val="15"/>
+              </w:rPr>
+              <w:t>Submit/approve/deny commands</w:t>
+            </w:r>
+          </w:p>
+        </w:tc>
+        <w:tc>
+          <w:tcPr>
+            <w:tcW w:type="dxa" w:w="2340"/>
+            <w:vAlign w:val="center"/>
+          </w:tcPr>
+          <w:p>
+            <w:r>
+              <w:rPr>
+                <w:sz w:val="15"/>
+              </w:rPr>
+              <w:t>PostgreSQL and export renderer</w:t>
+            </w:r>
+          </w:p>
+        </w:tc>
+        <w:tc>
+          <w:tcPr>
+            <w:tcW w:type="dxa" w:w="2340"/>
+            <w:vAlign w:val="center"/>
+          </w:tcPr>
+          <w:p>
+            <w:r>
+              <w:rPr>
+                <w:sz w:val="15"/>
+              </w:rPr>
+              <w:t>Transactional status and immutable snapshot</w:t>
+            </w:r>
+          </w:p>
+        </w:tc>
+      </w:tr>
+      <w:tr>
+        <w:tc>
+          <w:tcPr>
+            <w:tcW w:type="dxa" w:w="2340"/>
+            <w:vAlign w:val="center"/>
+          </w:tcPr>
+          <w:p>
+            <w:r>
+              <w:rPr>
+                <w:sz w:val="15"/>
+              </w:rPr>
+              <w:t>MCP service</w:t>
+            </w:r>
+          </w:p>
+        </w:tc>
+        <w:tc>
+          <w:tcPr>
+            <w:tcW w:type="dxa" w:w="2340"/>
+            <w:vAlign w:val="center"/>
+          </w:tcPr>
+          <w:p>
+            <w:r>
+              <w:rPr>
+                <w:sz w:val="15"/>
+              </w:rPr>
+              <w:t>Owner/company-scoped tool call</w:t>
+            </w:r>
+          </w:p>
+        </w:tc>
+        <w:tc>
+          <w:tcPr>
+            <w:tcW w:type="dxa" w:w="2340"/>
+            <w:vAlign w:val="center"/>
+          </w:tcPr>
+          <w:p>
+            <w:r>
+              <w:rPr>
+                <w:sz w:val="15"/>
+              </w:rPr>
+              <w:t>MCP SSE endpoint</w:t>
+            </w:r>
+          </w:p>
+        </w:tc>
+        <w:tc>
+          <w:tcPr>
+            <w:tcW w:type="dxa" w:w="2340"/>
+            <w:vAlign w:val="center"/>
+          </w:tcPr>
+          <w:p>
+            <w:r>
+              <w:rPr>
+                <w:sz w:val="15"/>
+              </w:rPr>
+              <w:t>Circuit breaker; graceful degradation</w:t>
+            </w:r>
+          </w:p>
+        </w:tc>
+      </w:tr>
+    </w:tbl>
     <w:p ns2:paraId="395D005C" ns2:textId="2F72E98A">
       <w:pPr>
         <w:pStyle w:val="Heading2"/>
@@ -20521,6 +21172,78 @@
         </w:tc>
       </w:tr>
     </w:tbl>
+    <w:p>
+      <w:pPr>
+        <w:pStyle w:val="Heading3"/>
+      </w:pPr>
+      <w:r>
+        <w:t>Narrative Generation Sequence Design</w:t>
+      </w:r>
+    </w:p>
+    <w:p>
+      <w:pPr>
+        <w:pStyle w:val="CSTemplate-Normal"/>
+      </w:pPr>
+      <w:r>
+        <w:t>Generation is a staged transaction with durable content written only after output normalization and evaluation. Custom instructions and templates are moderated first. Evidence is then selected using cached company summaries, relevant structured tables, deal/company libraries, and validated section URLs.</w:t>
+      </w:r>
+    </w:p>
+    <w:p>
+      <w:pPr>
+        <w:pStyle w:val="CSTemplate-Normal"/>
+      </w:pPr>
+      <w:r>
+        <w:t>The orchestration result identifies priority documents, structured data, search queries, gaps, and confidence. The section agent receives only the deal fields and evidence relevant to its section. Claim classification and the configured confidence judge execute after generation; the narrative, sources, metrics, and narrative version are persisted together.</w:t>
+      </w:r>
+    </w:p>
+    <w:p>
+      <w:pPr>
+        <w:jc w:val="center"/>
+      </w:pPr>
+      <w:r>
+        <w:drawing>
+          <wp:inline xmlns:wp="http://schemas.openxmlformats.org/drawingml/2006/wordprocessingDrawing" xmlns:a="http://schemas.openxmlformats.org/drawingml/2006/main" xmlns:pic="http://schemas.openxmlformats.org/drawingml/2006/picture">
+            <wp:extent cx="6035040" cy="3474154"/>
+            <wp:docPr id="3" name="Picture 3"/>
+            <wp:cNvGraphicFramePr>
+              <a:graphicFrameLocks noChangeAspect="1"/>
+            </wp:cNvGraphicFramePr>
+            <a:graphic>
+              <a:graphicData uri="http://schemas.openxmlformats.org/drawingml/2006/picture">
+                <pic:pic>
+                  <pic:nvPicPr>
+                    <pic:cNvPr id="0" name="03_generation_sequence.png"/>
+                    <pic:cNvPicPr/>
+                  </pic:nvPicPr>
+                  <pic:blipFill>
+                    <a:blip ns3:embed="rId29"/>
+                    <a:stretch>
+                      <a:fillRect/>
+                    </a:stretch>
+                  </pic:blipFill>
+                  <pic:spPr>
+                    <a:xfrm>
+                      <a:off x="0" y="0"/>
+                      <a:ext cx="6035040" cy="3474154"/>
+                    </a:xfrm>
+                    <a:prstGeom prst="rect"/>
+                  </pic:spPr>
+                </pic:pic>
+              </a:graphicData>
+            </a:graphic>
+          </wp:inline>
+        </w:drawing>
+      </w:r>
+    </w:p>
+    <w:p>
+      <w:pPr>
+        <w:pStyle w:val="Caption"/>
+        <w:jc w:val="center"/>
+      </w:pPr>
+      <w:r>
+        <w:t>Figure: Narrative Generation Sequence Design</w:t>
+      </w:r>
+    </w:p>
     <w:p ns2:paraId="5FDDF523" ns2:textId="77777777">
       <w:pPr>
         <w:pStyle w:val="Heading2"/>
@@ -22338,6 +23061,361 @@
             </w:pPr>
             <w:r>
               <w:t xml:space="preserve">User; AuthSession; AuditEvent; password policy</w:t>
+            </w:r>
+          </w:p>
+        </w:tc>
+      </w:tr>
+    </w:tbl>
+    <w:p>
+      <w:pPr>
+        <w:pStyle w:val="Heading3"/>
+      </w:pPr>
+      <w:r>
+        <w:t>Detailed Logical Data Design</w:t>
+      </w:r>
+    </w:p>
+    <w:p>
+      <w:pPr>
+        <w:pStyle w:val="CSTemplate-Normal"/>
+      </w:pPr>
+      <w:r>
+        <w:t>Identity and workflow records live in the backend database. Company intelligence lives in the MCP database and is always resolved with the application user ID. Documents are represented by managed-library identifiers and backend synchronization metadata; raw files are never treated as authorization records.</w:t>
+      </w:r>
+    </w:p>
+    <w:p>
+      <w:pPr>
+        <w:pStyle w:val="CSTemplate-Normal"/>
+      </w:pPr>
+      <w:r>
+        <w:t>NarrativeVersion captures editable section history. Review Version is a distinct aggregate containing a frozen JSON snapshot of deal metadata and ordered section content. This separation allows draft evolution while ensuring a submitted review artifact cannot change retrospectively.</w:t>
+      </w:r>
+    </w:p>
+    <w:p>
+      <w:pPr>
+        <w:jc w:val="center"/>
+      </w:pPr>
+      <w:r>
+        <w:drawing>
+          <wp:inline xmlns:wp="http://schemas.openxmlformats.org/drawingml/2006/wordprocessingDrawing" xmlns:a="http://schemas.openxmlformats.org/drawingml/2006/main" xmlns:pic="http://schemas.openxmlformats.org/drawingml/2006/picture">
+            <wp:extent cx="6035040" cy="3756740"/>
+            <wp:docPr id="4" name="Picture 4"/>
+            <wp:cNvGraphicFramePr>
+              <a:graphicFrameLocks noChangeAspect="1"/>
+            </wp:cNvGraphicFramePr>
+            <a:graphic>
+              <a:graphicData uri="http://schemas.openxmlformats.org/drawingml/2006/picture">
+                <pic:pic>
+                  <pic:nvPicPr>
+                    <pic:cNvPr id="0" name="04_logical_data_model.png"/>
+                    <pic:cNvPicPr/>
+                  </pic:nvPicPr>
+                  <pic:blipFill>
+                    <a:blip ns3:embed="rId30"/>
+                    <a:stretch>
+                      <a:fillRect/>
+                    </a:stretch>
+                  </pic:blipFill>
+                  <pic:spPr>
+                    <a:xfrm>
+                      <a:off x="0" y="0"/>
+                      <a:ext cx="6035040" cy="3756740"/>
+                    </a:xfrm>
+                    <a:prstGeom prst="rect"/>
+                  </pic:spPr>
+                </pic:pic>
+              </a:graphicData>
+            </a:graphic>
+          </wp:inline>
+        </w:drawing>
+      </w:r>
+    </w:p>
+    <w:p>
+      <w:pPr>
+        <w:pStyle w:val="Caption"/>
+        <w:jc w:val="center"/>
+      </w:pPr>
+      <w:r>
+        <w:t>Figure: Detailed Logical Data Design</w:t>
+      </w:r>
+    </w:p>
+    <w:tbl>
+      <w:tblPr>
+        <w:tblStyle w:val="TableGrid"/>
+        <w:tblW w:type="auto" w:w="0"/>
+        <w:jc w:val="center"/>
+        <w:tblLook w:firstColumn="1" w:firstRow="1" w:lastColumn="0" w:lastRow="0" w:noHBand="0" w:noVBand="1" w:val="04A0"/>
+      </w:tblPr>
+      <w:tblGrid>
+        <w:gridCol w:w="3120"/>
+        <w:gridCol w:w="3120"/>
+        <w:gridCol w:w="3120"/>
+      </w:tblGrid>
+      <w:tr>
+        <w:tc>
+          <w:tcPr>
+            <w:tcW w:type="dxa" w:w="3120"/>
+            <w:shd w:fill="D9EAF7"/>
+            <w:vAlign w:val="center"/>
+          </w:tcPr>
+          <w:p>
+            <w:r>
+              <w:rPr>
+                <w:b/>
+                <w:sz w:val="16"/>
+              </w:rPr>
+              <w:t>Aggregate</w:t>
+            </w:r>
+          </w:p>
+        </w:tc>
+        <w:tc>
+          <w:tcPr>
+            <w:tcW w:type="dxa" w:w="3120"/>
+            <w:shd w:fill="D9EAF7"/>
+            <w:vAlign w:val="center"/>
+          </w:tcPr>
+          <w:p>
+            <w:r>
+              <w:rPr>
+                <w:b/>
+                <w:sz w:val="16"/>
+              </w:rPr>
+              <w:t>Invariant</w:t>
+            </w:r>
+          </w:p>
+        </w:tc>
+        <w:tc>
+          <w:tcPr>
+            <w:tcW w:type="dxa" w:w="3120"/>
+            <w:shd w:fill="D9EAF7"/>
+            <w:vAlign w:val="center"/>
+          </w:tcPr>
+          <w:p>
+            <w:r>
+              <w:rPr>
+                <w:b/>
+                <w:sz w:val="16"/>
+              </w:rPr>
+              <w:t>Lifecycle</w:t>
+            </w:r>
+          </w:p>
+        </w:tc>
+      </w:tr>
+      <w:tr>
+        <w:tc>
+          <w:tcPr>
+            <w:tcW w:type="dxa" w:w="3120"/>
+            <w:vAlign w:val="center"/>
+          </w:tcPr>
+          <w:p>
+            <w:r>
+              <w:rPr>
+                <w:sz w:val="15"/>
+              </w:rPr>
+              <w:t>User / AuthSession</w:t>
+            </w:r>
+          </w:p>
+        </w:tc>
+        <w:tc>
+          <w:tcPr>
+            <w:tcW w:type="dxa" w:w="3120"/>
+            <w:vAlign w:val="center"/>
+          </w:tcPr>
+          <w:p>
+            <w:r>
+              <w:rPr>
+                <w:sz w:val="15"/>
+              </w:rPr>
+              <w:t>Raw session token is never persisted</w:t>
+            </w:r>
+          </w:p>
+        </w:tc>
+        <w:tc>
+          <w:tcPr>
+            <w:tcW w:type="dxa" w:w="3120"/>
+            <w:vAlign w:val="center"/>
+          </w:tcPr>
+          <w:p>
+            <w:r>
+              <w:rPr>
+                <w:sz w:val="15"/>
+              </w:rPr>
+              <w:t>Create, expire, revoke</w:t>
+            </w:r>
+          </w:p>
+        </w:tc>
+      </w:tr>
+      <w:tr>
+        <w:tc>
+          <w:tcPr>
+            <w:tcW w:type="dxa" w:w="3120"/>
+            <w:vAlign w:val="center"/>
+          </w:tcPr>
+          <w:p>
+            <w:r>
+              <w:rPr>
+                <w:sz w:val="15"/>
+              </w:rPr>
+              <w:t>Deal / Section</w:t>
+            </w:r>
+          </w:p>
+        </w:tc>
+        <w:tc>
+          <w:tcPr>
+            <w:tcW w:type="dxa" w:w="3120"/>
+            <w:vAlign w:val="center"/>
+          </w:tcPr>
+          <w:p>
+            <w:r>
+              <w:rPr>
+                <w:sz w:val="15"/>
+              </w:rPr>
+              <w:t>Deal access is owner- or analyst-scoped</w:t>
+            </w:r>
+          </w:p>
+        </w:tc>
+        <w:tc>
+          <w:tcPr>
+            <w:tcW w:type="dxa" w:w="3120"/>
+            <w:vAlign w:val="center"/>
+          </w:tcPr>
+          <w:p>
+            <w:r>
+              <w:rPr>
+                <w:sz w:val="15"/>
+              </w:rPr>
+              <w:t>Draft → In Progress → In Review → Approved</w:t>
+            </w:r>
+          </w:p>
+        </w:tc>
+      </w:tr>
+      <w:tr>
+        <w:tc>
+          <w:tcPr>
+            <w:tcW w:type="dxa" w:w="3120"/>
+            <w:vAlign w:val="center"/>
+          </w:tcPr>
+          <w:p>
+            <w:r>
+              <w:rPr>
+                <w:sz w:val="15"/>
+              </w:rPr>
+              <w:t>NarrativeVersion</w:t>
+            </w:r>
+          </w:p>
+        </w:tc>
+        <w:tc>
+          <w:tcPr>
+            <w:tcW w:type="dxa" w:w="3120"/>
+            <w:vAlign w:val="center"/>
+          </w:tcPr>
+          <w:p>
+            <w:r>
+              <w:rPr>
+                <w:sz w:val="15"/>
+              </w:rPr>
+              <w:t>History belongs to one section; final selection is explicit</w:t>
+            </w:r>
+          </w:p>
+        </w:tc>
+        <w:tc>
+          <w:tcPr>
+            <w:tcW w:type="dxa" w:w="3120"/>
+            <w:vAlign w:val="center"/>
+          </w:tcPr>
+          <w:p>
+            <w:r>
+              <w:rPr>
+                <w:sz w:val="15"/>
+              </w:rPr>
+              <w:t>Generate/edit, compare, mark final, delete with fallback</w:t>
+            </w:r>
+          </w:p>
+        </w:tc>
+      </w:tr>
+      <w:tr>
+        <w:tc>
+          <w:tcPr>
+            <w:tcW w:type="dxa" w:w="3120"/>
+            <w:vAlign w:val="center"/>
+          </w:tcPr>
+          <w:p>
+            <w:r>
+              <w:rPr>
+                <w:sz w:val="15"/>
+              </w:rPr>
+              <w:t>Review Version</w:t>
+            </w:r>
+          </w:p>
+        </w:tc>
+        <w:tc>
+          <w:tcPr>
+            <w:tcW w:type="dxa" w:w="3120"/>
+            <w:vAlign w:val="center"/>
+          </w:tcPr>
+          <w:p>
+            <w:r>
+              <w:rPr>
+                <w:sz w:val="15"/>
+              </w:rPr>
+              <w:t>Snapshot is immutable after submission</w:t>
+            </w:r>
+          </w:p>
+        </w:tc>
+        <w:tc>
+          <w:tcPr>
+            <w:tcW w:type="dxa" w:w="3120"/>
+            <w:vAlign w:val="center"/>
+          </w:tcPr>
+          <w:p>
+            <w:r>
+              <w:rPr>
+                <w:sz w:val="15"/>
+              </w:rPr>
+              <w:t>Submit, approve/deny, frozen download</w:t>
+            </w:r>
+          </w:p>
+        </w:tc>
+      </w:tr>
+      <w:tr>
+        <w:tc>
+          <w:tcPr>
+            <w:tcW w:type="dxa" w:w="3120"/>
+            <w:vAlign w:val="center"/>
+          </w:tcPr>
+          <w:p>
+            <w:r>
+              <w:rPr>
+                <w:sz w:val="15"/>
+              </w:rPr>
+              <w:t>Company intelligence</w:t>
+            </w:r>
+          </w:p>
+        </w:tc>
+        <w:tc>
+          <w:tcPr>
+            <w:tcW w:type="dxa" w:w="3120"/>
+            <w:vAlign w:val="center"/>
+          </w:tcPr>
+          <w:p>
+            <w:r>
+              <w:rPr>
+                <w:sz w:val="15"/>
+              </w:rPr>
+              <w:t>Company is scoped by owner user ID</w:t>
+            </w:r>
+          </w:p>
+        </w:tc>
+        <w:tc>
+          <w:tcPr>
+            <w:tcW w:type="dxa" w:w="3120"/>
+            <w:vAlign w:val="center"/>
+          </w:tcPr>
+          <w:p>
+            <w:r>
+              <w:rPr>
+                <w:sz w:val="15"/>
+              </w:rPr>
+              <w:t>Manufacture/sync, query, refresh idempotently</w:t>
             </w:r>
           </w:p>
         </w:tc>
@@ -24006,6 +25084,448 @@
             </w:pPr>
             <w:r>
               <w:t xml:space="preserve">Generation, retrieval, evaluation, telemetry</w:t>
+            </w:r>
+          </w:p>
+        </w:tc>
+      </w:tr>
+    </w:tbl>
+    <w:p>
+      <w:pPr>
+        <w:pStyle w:val="Heading3"/>
+      </w:pPr>
+      <w:r>
+        <w:t>Detailed Deployment Design</w:t>
+      </w:r>
+    </w:p>
+    <w:p>
+      <w:pPr>
+        <w:pStyle w:val="CSTemplate-Normal"/>
+      </w:pPr>
+      <w:r>
+        <w:t>The local topology runs the frontend, backend, MCP, and PostgreSQL as separate processes. Production should place the UI and API behind HTTPS, use supervised service instances, isolate backend and MCP databases, externalize files to durable object storage, and send redacted traces to an approved collector.</w:t>
+      </w:r>
+    </w:p>
+    <w:p>
+      <w:pPr>
+        <w:pStyle w:val="CSTemplate-Normal"/>
+      </w:pPr>
+      <w:r>
+        <w:t>Horizontal scaling requires replacing in-memory job registries and process-local agent scoping with durable jobs and distributed or request-isolated coordination. Database backups, object versioning, restore testing, egress control, capacity limits, and rollback procedures are mandatory production concerns.</w:t>
+      </w:r>
+    </w:p>
+    <w:p>
+      <w:pPr>
+        <w:jc w:val="center"/>
+      </w:pPr>
+      <w:r>
+        <w:drawing>
+          <wp:inline xmlns:wp="http://schemas.openxmlformats.org/drawingml/2006/wordprocessingDrawing" xmlns:a="http://schemas.openxmlformats.org/drawingml/2006/main" xmlns:pic="http://schemas.openxmlformats.org/drawingml/2006/picture">
+            <wp:extent cx="6035040" cy="3756740"/>
+            <wp:docPr id="5" name="Picture 5"/>
+            <wp:cNvGraphicFramePr>
+              <a:graphicFrameLocks noChangeAspect="1"/>
+            </wp:cNvGraphicFramePr>
+            <a:graphic>
+              <a:graphicData uri="http://schemas.openxmlformats.org/drawingml/2006/picture">
+                <pic:pic>
+                  <pic:nvPicPr>
+                    <pic:cNvPr id="0" name="05_deployment.png"/>
+                    <pic:cNvPicPr/>
+                  </pic:nvPicPr>
+                  <pic:blipFill>
+                    <a:blip ns3:embed="rId31"/>
+                    <a:stretch>
+                      <a:fillRect/>
+                    </a:stretch>
+                  </pic:blipFill>
+                  <pic:spPr>
+                    <a:xfrm>
+                      <a:off x="0" y="0"/>
+                      <a:ext cx="6035040" cy="3756740"/>
+                    </a:xfrm>
+                    <a:prstGeom prst="rect"/>
+                  </pic:spPr>
+                </pic:pic>
+              </a:graphicData>
+            </a:graphic>
+          </wp:inline>
+        </w:drawing>
+      </w:r>
+    </w:p>
+    <w:p>
+      <w:pPr>
+        <w:pStyle w:val="Caption"/>
+        <w:jc w:val="center"/>
+      </w:pPr>
+      <w:r>
+        <w:t>Figure: Detailed Deployment Design</w:t>
+      </w:r>
+    </w:p>
+    <w:tbl>
+      <w:tblPr>
+        <w:tblStyle w:val="TableGrid"/>
+        <w:tblW w:type="auto" w:w="0"/>
+        <w:jc w:val="center"/>
+        <w:tblLook w:firstColumn="1" w:firstRow="1" w:lastColumn="0" w:lastRow="0" w:noHBand="0" w:noVBand="1" w:val="04A0"/>
+      </w:tblPr>
+      <w:tblGrid>
+        <w:gridCol w:w="2340"/>
+        <w:gridCol w:w="2340"/>
+        <w:gridCol w:w="2340"/>
+        <w:gridCol w:w="2340"/>
+      </w:tblGrid>
+      <w:tr>
+        <w:tc>
+          <w:tcPr>
+            <w:tcW w:type="dxa" w:w="2340"/>
+            <w:shd w:fill="D9EAF7"/>
+            <w:vAlign w:val="center"/>
+          </w:tcPr>
+          <w:p>
+            <w:r>
+              <w:rPr>
+                <w:b/>
+                <w:sz w:val="16"/>
+              </w:rPr>
+              <w:t>Deployable</w:t>
+            </w:r>
+          </w:p>
+        </w:tc>
+        <w:tc>
+          <w:tcPr>
+            <w:tcW w:type="dxa" w:w="2340"/>
+            <w:shd w:fill="D9EAF7"/>
+            <w:vAlign w:val="center"/>
+          </w:tcPr>
+          <w:p>
+            <w:r>
+              <w:rPr>
+                <w:b/>
+                <w:sz w:val="16"/>
+              </w:rPr>
+              <w:t>Ports / protocol</w:t>
+            </w:r>
+          </w:p>
+        </w:tc>
+        <w:tc>
+          <w:tcPr>
+            <w:tcW w:type="dxa" w:w="2340"/>
+            <w:shd w:fill="D9EAF7"/>
+            <w:vAlign w:val="center"/>
+          </w:tcPr>
+          <w:p>
+            <w:r>
+              <w:rPr>
+                <w:b/>
+                <w:sz w:val="16"/>
+              </w:rPr>
+              <w:t>Scaling unit</w:t>
+            </w:r>
+          </w:p>
+        </w:tc>
+        <w:tc>
+          <w:tcPr>
+            <w:tcW w:type="dxa" w:w="2340"/>
+            <w:shd w:fill="D9EAF7"/>
+            <w:vAlign w:val="center"/>
+          </w:tcPr>
+          <w:p>
+            <w:r>
+              <w:rPr>
+                <w:b/>
+                <w:sz w:val="16"/>
+              </w:rPr>
+              <w:t>State</w:t>
+            </w:r>
+          </w:p>
+        </w:tc>
+      </w:tr>
+      <w:tr>
+        <w:tc>
+          <w:tcPr>
+            <w:tcW w:type="dxa" w:w="2340"/>
+            <w:vAlign w:val="center"/>
+          </w:tcPr>
+          <w:p>
+            <w:r>
+              <w:rPr>
+                <w:sz w:val="15"/>
+              </w:rPr>
+              <w:t>Web client / proxy</w:t>
+            </w:r>
+          </w:p>
+        </w:tc>
+        <w:tc>
+          <w:tcPr>
+            <w:tcW w:type="dxa" w:w="2340"/>
+            <w:vAlign w:val="center"/>
+          </w:tcPr>
+          <w:p>
+            <w:r>
+              <w:rPr>
+                <w:sz w:val="15"/>
+              </w:rPr>
+              <w:t>443 externally; local UI 8080</w:t>
+            </w:r>
+          </w:p>
+        </w:tc>
+        <w:tc>
+          <w:tcPr>
+            <w:tcW w:type="dxa" w:w="2340"/>
+            <w:vAlign w:val="center"/>
+          </w:tcPr>
+          <w:p>
+            <w:r>
+              <w:rPr>
+                <w:sz w:val="15"/>
+              </w:rPr>
+              <w:t>Static replicas / edge cache</w:t>
+            </w:r>
+          </w:p>
+        </w:tc>
+        <w:tc>
+          <w:tcPr>
+            <w:tcW w:type="dxa" w:w="2340"/>
+            <w:vAlign w:val="center"/>
+          </w:tcPr>
+          <w:p>
+            <w:r>
+              <w:rPr>
+                <w:sz w:val="15"/>
+              </w:rPr>
+              <w:t>Stateless</w:t>
+            </w:r>
+          </w:p>
+        </w:tc>
+      </w:tr>
+      <w:tr>
+        <w:tc>
+          <w:tcPr>
+            <w:tcW w:type="dxa" w:w="2340"/>
+            <w:vAlign w:val="center"/>
+          </w:tcPr>
+          <w:p>
+            <w:r>
+              <w:rPr>
+                <w:sz w:val="15"/>
+              </w:rPr>
+              <w:t>FastAPI backend</w:t>
+            </w:r>
+          </w:p>
+        </w:tc>
+        <w:tc>
+          <w:tcPr>
+            <w:tcW w:type="dxa" w:w="2340"/>
+            <w:vAlign w:val="center"/>
+          </w:tcPr>
+          <w:p>
+            <w:r>
+              <w:rPr>
+                <w:sz w:val="15"/>
+              </w:rPr>
+              <w:t>HTTPS; local 8000</w:t>
+            </w:r>
+          </w:p>
+        </w:tc>
+        <w:tc>
+          <w:tcPr>
+            <w:tcW w:type="dxa" w:w="2340"/>
+            <w:vAlign w:val="center"/>
+          </w:tcPr>
+          <w:p>
+            <w:r>
+              <w:rPr>
+                <w:sz w:val="15"/>
+              </w:rPr>
+              <w:t>Application instance</w:t>
+            </w:r>
+          </w:p>
+        </w:tc>
+        <w:tc>
+          <w:tcPr>
+            <w:tcW w:type="dxa" w:w="2340"/>
+            <w:vAlign w:val="center"/>
+          </w:tcPr>
+          <w:p>
+            <w:r>
+              <w:rPr>
+                <w:sz w:val="15"/>
+              </w:rPr>
+              <w:t>Stateless target; jobs currently in process</w:t>
+            </w:r>
+          </w:p>
+        </w:tc>
+      </w:tr>
+      <w:tr>
+        <w:tc>
+          <w:tcPr>
+            <w:tcW w:type="dxa" w:w="2340"/>
+            <w:vAlign w:val="center"/>
+          </w:tcPr>
+          <w:p>
+            <w:r>
+              <w:rPr>
+                <w:sz w:val="15"/>
+              </w:rPr>
+              <w:t>Local MCP</w:t>
+            </w:r>
+          </w:p>
+        </w:tc>
+        <w:tc>
+          <w:tcPr>
+            <w:tcW w:type="dxa" w:w="2340"/>
+            <w:vAlign w:val="center"/>
+          </w:tcPr>
+          <w:p>
+            <w:r>
+              <w:rPr>
+                <w:sz w:val="15"/>
+              </w:rPr>
+              <w:t>SSE; local 8001</w:t>
+            </w:r>
+          </w:p>
+        </w:tc>
+        <w:tc>
+          <w:tcPr>
+            <w:tcW w:type="dxa" w:w="2340"/>
+            <w:vAlign w:val="center"/>
+          </w:tcPr>
+          <w:p>
+            <w:r>
+              <w:rPr>
+                <w:sz w:val="15"/>
+              </w:rPr>
+              <w:t>MCP instance</w:t>
+            </w:r>
+          </w:p>
+        </w:tc>
+        <w:tc>
+          <w:tcPr>
+            <w:tcW w:type="dxa" w:w="2340"/>
+            <w:vAlign w:val="center"/>
+          </w:tcPr>
+          <w:p>
+            <w:r>
+              <w:rPr>
+                <w:sz w:val="15"/>
+              </w:rPr>
+              <w:t>Cache/circuit state plus PostgreSQL</w:t>
+            </w:r>
+          </w:p>
+        </w:tc>
+      </w:tr>
+      <w:tr>
+        <w:tc>
+          <w:tcPr>
+            <w:tcW w:type="dxa" w:w="2340"/>
+            <w:vAlign w:val="center"/>
+          </w:tcPr>
+          <w:p>
+            <w:r>
+              <w:rPr>
+                <w:sz w:val="15"/>
+              </w:rPr>
+              <w:t>PostgreSQL</w:t>
+            </w:r>
+          </w:p>
+        </w:tc>
+        <w:tc>
+          <w:tcPr>
+            <w:tcW w:type="dxa" w:w="2340"/>
+            <w:vAlign w:val="center"/>
+          </w:tcPr>
+          <w:p>
+            <w:r>
+              <w:rPr>
+                <w:sz w:val="15"/>
+              </w:rPr>
+              <w:t>SQL/TLS</w:t>
+            </w:r>
+          </w:p>
+        </w:tc>
+        <w:tc>
+          <w:tcPr>
+            <w:tcW w:type="dxa" w:w="2340"/>
+            <w:vAlign w:val="center"/>
+          </w:tcPr>
+          <w:p>
+            <w:r>
+              <w:rPr>
+                <w:sz w:val="15"/>
+              </w:rPr>
+              <w:t>Managed cluster or database host</w:t>
+            </w:r>
+          </w:p>
+        </w:tc>
+        <w:tc>
+          <w:tcPr>
+            <w:tcW w:type="dxa" w:w="2340"/>
+            <w:vAlign w:val="center"/>
+          </w:tcPr>
+          <w:p>
+            <w:r>
+              <w:rPr>
+                <w:sz w:val="15"/>
+              </w:rPr>
+              <w:t>Durable</w:t>
+            </w:r>
+          </w:p>
+        </w:tc>
+      </w:tr>
+      <w:tr>
+        <w:tc>
+          <w:tcPr>
+            <w:tcW w:type="dxa" w:w="2340"/>
+            <w:vAlign w:val="center"/>
+          </w:tcPr>
+          <w:p>
+            <w:r>
+              <w:rPr>
+                <w:sz w:val="15"/>
+              </w:rPr>
+              <w:t>Mistral / Phoenix</w:t>
+            </w:r>
+          </w:p>
+        </w:tc>
+        <w:tc>
+          <w:tcPr>
+            <w:tcW w:type="dxa" w:w="2340"/>
+            <w:vAlign w:val="center"/>
+          </w:tcPr>
+          <w:p>
+            <w:r>
+              <w:rPr>
+                <w:sz w:val="15"/>
+              </w:rPr>
+              <w:t>HTTPS / OTLP</w:t>
+            </w:r>
+          </w:p>
+        </w:tc>
+        <w:tc>
+          <w:tcPr>
+            <w:tcW w:type="dxa" w:w="2340"/>
+            <w:vAlign w:val="center"/>
+          </w:tcPr>
+          <w:p>
+            <w:r>
+              <w:rPr>
+                <w:sz w:val="15"/>
+              </w:rPr>
+              <w:t>External managed services</w:t>
+            </w:r>
+          </w:p>
+        </w:tc>
+        <w:tc>
+          <w:tcPr>
+            <w:tcW w:type="dxa" w:w="2340"/>
+            <w:vAlign w:val="center"/>
+          </w:tcPr>
+          <w:p>
+            <w:r>
+              <w:rPr>
+                <w:sz w:val="15"/>
+              </w:rPr>
+              <w:t>Vendor-managed</w:t>
             </w:r>
           </w:p>
         </w:tc>

</xml_diff>